<commit_message>
docs: added data understanding section
Added the Data Understanding section for the CA2 IDS report following the CRISP-DM Phase 2 structure.

Documented the CICIDS2017 dataset description, loading process, merged dataset shape, initial structure, target variable and class distribution.

Summarised key data quality findings including class imbalance, rare attack classes, missing values, infinite values, duplicates, constant features and highly correlated features.

Added statistical summary, outlier observations and EDA findings, including class distribution, correlation heatmap and boxplot analysis.

Linked the findings to the next Data Preparation phase, where cleaning, feature reduction, train/test split and controlled multiclass dataset preparation were applied.
</commit_message>
<xml_diff>
--- a/Sander2022164_Thiago2022161_Report.docx
+++ b/Sander2022164_Thiago2022161_Report.docx
@@ -2494,13 +2494,6 @@
     </w:p>
     <w:p>
       <w:pPr>
-        <w:rPr>
-          <w:szCs w:val="24"/>
-        </w:rPr>
-      </w:pPr>
-    </w:p>
-    <w:p>
-      <w:pPr>
         <w:pStyle w:val="Heading1"/>
         <w:numPr>
           <w:ilvl w:val="0"/>
@@ -2522,6 +2515,449 @@
           <w:bCs/>
           <w:color w:val="auto"/>
         </w:rPr>
+        <w:t>Data Understanding</w:t>
+      </w:r>
+      <w:r>
+        <w:rPr>
+          <w:rFonts w:ascii="Times New Roman" w:hAnsi="Times New Roman" w:cs="Times New Roman"/>
+          <w:b/>
+          <w:bCs/>
+          <w:color w:val="auto"/>
+        </w:rPr>
+        <w:t xml:space="preserve"> </w:t>
+      </w:r>
+      <w:r>
+        <w:rPr>
+          <w:rFonts w:ascii="Times New Roman" w:hAnsi="Times New Roman" w:cs="Times New Roman"/>
+          <w:b/>
+          <w:bCs/>
+          <w:color w:val="auto"/>
+        </w:rPr>
+        <w:t xml:space="preserve">(CRISP-DM Phase </w:t>
+      </w:r>
+      <w:r>
+        <w:rPr>
+          <w:rFonts w:ascii="Times New Roman" w:hAnsi="Times New Roman" w:cs="Times New Roman"/>
+          <w:b/>
+          <w:bCs/>
+          <w:color w:val="auto"/>
+        </w:rPr>
+        <w:t>2</w:t>
+      </w:r>
+      <w:r>
+        <w:rPr>
+          <w:rFonts w:ascii="Times New Roman" w:hAnsi="Times New Roman" w:cs="Times New Roman"/>
+          <w:b/>
+          <w:bCs/>
+          <w:color w:val="auto"/>
+        </w:rPr>
+        <w:t>)</w:t>
+      </w:r>
+    </w:p>
+    <w:p>
+      <w:r>
+        <w:t>The goal of this phase was to understand the CICIDS2017 dataset before cleaning, preparation and modelling. This was crucial as the quality and structure of the data directly impact the reliability of the machine learning outcomes.</w:t>
+      </w:r>
+    </w:p>
+    <w:p>
+      <w:r>
+        <w:t>The aim was to check the structure of the data, understand the target variable, look at the class distribution, and look for initial data quality problems including missing and infinite values, duplicated rows, outliers, imbalance and redundant features.</w:t>
+      </w:r>
+    </w:p>
+    <w:p>
+      <w:pPr>
+        <w:pStyle w:val="Heading2"/>
+      </w:pPr>
+      <w:r>
+        <w:t>4.1 Dataset Description</w:t>
+      </w:r>
+    </w:p>
+    <w:p>
+      <w:r>
+        <w:t>The dataset adopted for this project is CICIDS2017, which is a public cybersecurity dataset for intrusion detection research. It includes labelled network flow information such as benign traffic and various types of attacks.</w:t>
+      </w:r>
+    </w:p>
+    <w:p>
+      <w:r>
+        <w:lastRenderedPageBreak/>
+        <w:t xml:space="preserve">This dataset was chosen because it contains various types of attacks: DDoS, DoS, </w:t>
+      </w:r>
+      <w:proofErr w:type="spellStart"/>
+      <w:r>
+        <w:t>PortScan</w:t>
+      </w:r>
+      <w:proofErr w:type="spellEnd"/>
+      <w:r>
+        <w:t>, Bot, FTP-</w:t>
+      </w:r>
+      <w:proofErr w:type="spellStart"/>
+      <w:r>
+        <w:t>Patator</w:t>
+      </w:r>
+      <w:proofErr w:type="spellEnd"/>
+      <w:r>
+        <w:t>, SSH-</w:t>
+      </w:r>
+      <w:proofErr w:type="spellStart"/>
+      <w:r>
+        <w:t>Patator</w:t>
+      </w:r>
+      <w:proofErr w:type="spellEnd"/>
+      <w:r>
+        <w:t>, Web Attacks, Infiltration and Heartbleed. This makes it appropriate for a multiclass IDS project.</w:t>
+      </w:r>
+    </w:p>
+    <w:p>
+      <w:r>
+        <w:t>The target variable is the Label column that indicates whether each network flow is benign or an attack type.</w:t>
+      </w:r>
+    </w:p>
+    <w:p>
+      <w:pPr>
+        <w:pStyle w:val="Heading2"/>
+      </w:pPr>
+      <w:r>
+        <w:t>4.2 Dataset Loading and Structure</w:t>
+      </w:r>
+    </w:p>
+    <w:p>
+      <w:r>
+        <w:t xml:space="preserve">The CICIDS2017 dataset is divided into several CSV files. Each file represents a different traffic period or attack scenario. For this project, eight CSV files were loaded using Python and Pandas, and merged into a single </w:t>
+      </w:r>
+      <w:proofErr w:type="spellStart"/>
+      <w:r>
+        <w:t>dataframe</w:t>
+      </w:r>
+      <w:proofErr w:type="spellEnd"/>
+      <w:r>
+        <w:t>.</w:t>
+      </w:r>
+    </w:p>
+    <w:p>
+      <w:r>
+        <w:t>The dataset after merging included:</w:t>
+      </w:r>
+    </w:p>
+    <w:p>
+      <w:pPr>
+        <w:pStyle w:val="ListParagraph"/>
+        <w:numPr>
+          <w:ilvl w:val="0"/>
+          <w:numId w:val="1"/>
+        </w:numPr>
+        <w:rPr>
+          <w:szCs w:val="24"/>
+        </w:rPr>
+      </w:pPr>
+      <w:r>
+        <w:rPr>
+          <w:szCs w:val="24"/>
+        </w:rPr>
+        <w:t>8 source files</w:t>
+      </w:r>
+    </w:p>
+    <w:p>
+      <w:pPr>
+        <w:pStyle w:val="ListParagraph"/>
+        <w:numPr>
+          <w:ilvl w:val="0"/>
+          <w:numId w:val="1"/>
+        </w:numPr>
+        <w:rPr>
+          <w:szCs w:val="24"/>
+        </w:rPr>
+      </w:pPr>
+      <w:r>
+        <w:rPr>
+          <w:szCs w:val="24"/>
+        </w:rPr>
+        <w:t>2,830,743 rows</w:t>
+      </w:r>
+    </w:p>
+    <w:p>
+      <w:pPr>
+        <w:pStyle w:val="ListParagraph"/>
+        <w:numPr>
+          <w:ilvl w:val="0"/>
+          <w:numId w:val="1"/>
+        </w:numPr>
+        <w:rPr>
+          <w:szCs w:val="24"/>
+        </w:rPr>
+      </w:pPr>
+      <w:r>
+        <w:rPr>
+          <w:szCs w:val="24"/>
+        </w:rPr>
+        <w:t>79 columns</w:t>
+      </w:r>
+    </w:p>
+    <w:p>
+      <w:r>
+        <w:rPr>
+          <w:szCs w:val="24"/>
+        </w:rPr>
+        <w:t xml:space="preserve">The general structure of the source files was the same, with varying class distributions. For example, Monday had only benign traffic and other files had attacks like DDoS, </w:t>
+      </w:r>
+      <w:proofErr w:type="spellStart"/>
+      <w:r>
+        <w:rPr>
+          <w:szCs w:val="24"/>
+        </w:rPr>
+        <w:t>PortScan</w:t>
+      </w:r>
+      <w:proofErr w:type="spellEnd"/>
+      <w:r>
+        <w:rPr>
+          <w:szCs w:val="24"/>
+        </w:rPr>
+        <w:t>, DoS, Bot and Web Attacks.</w:t>
+      </w:r>
+    </w:p>
+    <w:p>
+      <w:r>
+        <w:rPr>
+          <w:szCs w:val="24"/>
+        </w:rPr>
+        <w:t xml:space="preserve">The first exploratory analysis revealed that the data is predominantly numerical. There were 79 columns, with 78 of them being numerical and only one (Label) being textual. This is convenient for machine learning, as Scikit-learn models are primarily designed to operate on numerical input data. </w:t>
+      </w:r>
+    </w:p>
+    <w:p>
+      <w:r>
+        <w:rPr>
+          <w:szCs w:val="24"/>
+        </w:rPr>
+        <w:t>This dataset also required approximately 1.7GB of memory, indicating that efficient preprocessing and feature reduction would be crucial for the lightweight IDS goal.</w:t>
+      </w:r>
+    </w:p>
+    <w:p>
+      <w:pPr>
+        <w:pStyle w:val="Heading2"/>
+      </w:pPr>
+      <w:r>
+        <w:t>4.3 Target Variable and Class Distribution</w:t>
+      </w:r>
+    </w:p>
+    <w:p>
+      <w:r>
+        <w:rPr>
+          <w:szCs w:val="24"/>
+        </w:rPr>
+        <w:t>The result of the target analysis revealed that the dataset is extremely imbalanced. The majority class (BENIGN) has 2,273,097 records which corresponds to approximately 80.30% of the entire dataset.</w:t>
+      </w:r>
+    </w:p>
+    <w:p>
+      <w:r>
+        <w:rPr>
+          <w:szCs w:val="24"/>
+        </w:rPr>
+        <w:t xml:space="preserve">The most frequent attack classes were DoS Hulk, </w:t>
+      </w:r>
+      <w:proofErr w:type="spellStart"/>
+      <w:r>
+        <w:rPr>
+          <w:szCs w:val="24"/>
+        </w:rPr>
+        <w:t>PortScan</w:t>
+      </w:r>
+      <w:proofErr w:type="spellEnd"/>
+      <w:r>
+        <w:rPr>
+          <w:szCs w:val="24"/>
+        </w:rPr>
+        <w:t xml:space="preserve"> and DDoS. But there were some classes of attacks with very few records: Infiltration (36 records), Web Attack SQL Injection (21 records) and Heartbleed (11 records).</w:t>
+      </w:r>
+    </w:p>
+    <w:p>
+      <w:r>
+        <w:rPr>
+          <w:szCs w:val="24"/>
+        </w:rPr>
+        <w:t>This imbalance matters because a model can reach high accuracy by predicting the majority classes but still perform poorly on rare attacks. For this reason, accuracy alone would not be enough to evaluate the IDS models.</w:t>
+      </w:r>
+    </w:p>
+    <w:p>
+      <w:pPr>
+        <w:pStyle w:val="Heading2"/>
+      </w:pPr>
+      <w:r>
+        <w:t>4.4 Missing, Infinite Values and Data Quality</w:t>
+      </w:r>
+    </w:p>
+    <w:p>
+      <w:r>
+        <w:rPr>
+          <w:szCs w:val="24"/>
+        </w:rPr>
+        <w:t>In the initial missing value check, the missing values were minimal and were mostly in the Flow Bytes/s column with a total of 1,358 missing values.</w:t>
+      </w:r>
+    </w:p>
+    <w:p>
+      <w:r>
+        <w:rPr>
+          <w:szCs w:val="24"/>
+        </w:rPr>
+        <w:t>There was also a need to check the dataset for infinite values as flow-rate features can produce infinity values due to division-based operations. Later, infinite values were found primarily in Flow Bytes/s and Flow Packets/s.</w:t>
+      </w:r>
+    </w:p>
+    <w:p>
+      <w:r>
+        <w:rPr>
+          <w:szCs w:val="24"/>
+        </w:rPr>
+        <w:lastRenderedPageBreak/>
+        <w:t>These values are important because machine learning models and scaling methods cannot work correctly with missing or infinite values. These problems were identified and documented at this point. The actual cleaning was done later in the Data Preparation phase.</w:t>
+      </w:r>
+    </w:p>
+    <w:p>
+      <w:r>
+        <w:rPr>
+          <w:szCs w:val="24"/>
+        </w:rPr>
+        <w:t>Constant features, highly correlated features and duplicated rows were also considered as issues to be checked before modelling. These matter because they could impact the reliability of the model, the time required for processing, or the complexity of the model.</w:t>
+      </w:r>
+    </w:p>
+    <w:p>
+      <w:pPr>
+        <w:pStyle w:val="Heading2"/>
+      </w:pPr>
+      <w:r>
+        <w:t>4.5 Statistical Summary and Outliers</w:t>
+      </w:r>
+    </w:p>
+    <w:p>
+      <w:r>
+        <w:rPr>
+          <w:szCs w:val="24"/>
+        </w:rPr>
+        <w:t>In the statistical summary, large differences were observed between the minimum and maximum values in many numerical features. Some features had medians close to zero but very large maximum values, showing skewness and long-tailed distributions.</w:t>
+      </w:r>
+    </w:p>
+    <w:p>
+      <w:r>
+        <w:rPr>
+          <w:szCs w:val="24"/>
+        </w:rPr>
+        <w:t>These extreme values are not necessarily errors in the network traffic data. They can be real activity like attacks, traffic bursts, or high-volume traffic. For this reason, outliers were not removed in this phase. They were documented as part of the dataset behaviour, and the large-scale differences justified the application of feature scaling later, primarily for Logistic Regression.</w:t>
+      </w:r>
+    </w:p>
+    <w:p>
+      <w:pPr>
+        <w:pStyle w:val="Heading2"/>
+      </w:pPr>
+      <w:r>
+        <w:t>4.6 Exploratory Data Analysis</w:t>
+      </w:r>
+    </w:p>
+    <w:p>
+      <w:r>
+        <w:rPr>
+          <w:szCs w:val="24"/>
+        </w:rPr>
+        <w:t>EDA was performed to gain insight into the dataset before cleaning and modelling.</w:t>
+      </w:r>
+    </w:p>
+    <w:p>
+      <w:r>
+        <w:rPr>
+          <w:szCs w:val="24"/>
+        </w:rPr>
+        <w:t>Since the BENIGN class is significantly larger than the other smaller attack classes, a class distribution chart with logarithmic scale was created. This made it easier to visualise rare classes like Heartbleed, Infiltration and SQL Injection.</w:t>
+      </w:r>
+    </w:p>
+    <w:p>
+      <w:r>
+        <w:rPr>
+          <w:szCs w:val="24"/>
+        </w:rPr>
+        <w:t xml:space="preserve">The correlation heatmap revealed strong correlation between certain numerical features, particularly the packet length, inter-arrival time and idle time features. This suggested that there was some redundancy in the features and that feature reduction was necessary. </w:t>
+      </w:r>
+    </w:p>
+    <w:p>
+      <w:r>
+        <w:rPr>
+          <w:szCs w:val="24"/>
+        </w:rPr>
+        <w:t xml:space="preserve">Selected features like Flow Duration, Total </w:t>
+      </w:r>
+      <w:proofErr w:type="spellStart"/>
+      <w:r>
+        <w:rPr>
+          <w:szCs w:val="24"/>
+        </w:rPr>
+        <w:t>Fwd</w:t>
+      </w:r>
+      <w:proofErr w:type="spellEnd"/>
+      <w:r>
+        <w:rPr>
+          <w:szCs w:val="24"/>
+        </w:rPr>
+        <w:t xml:space="preserve"> Packets, Total Backward Packets and Flow Bytes/s were also displayed using boxplots. These plots confirmed the presence of extreme values and skewness in the distributions.</w:t>
+      </w:r>
+    </w:p>
+    <w:p>
+      <w:pPr>
+        <w:pStyle w:val="Heading2"/>
+      </w:pPr>
+      <w:r>
+        <w:t>4.7 Data Understanding Summary</w:t>
+      </w:r>
+    </w:p>
+    <w:p>
+      <w:r>
+        <w:rPr>
+          <w:szCs w:val="24"/>
+        </w:rPr>
+        <w:t>Overall, the Data Understanding phase confirmed that CICIDS2017 is appropriate for this IDS project as it has a significant number of labelled benign and malicious network flow records.</w:t>
+      </w:r>
+    </w:p>
+    <w:p>
+      <w:r>
+        <w:rPr>
+          <w:szCs w:val="24"/>
+        </w:rPr>
+        <w:t>The analysis also revealed significant issues such as class imbalance, rare attack classes, missing and infinite values, duplicates, constant and highly correlated features and large-scale differences.</w:t>
+      </w:r>
+    </w:p>
+    <w:p>
+      <w:r>
+        <w:rPr>
+          <w:szCs w:val="24"/>
+        </w:rPr>
+        <w:t>This helped guide the Data Preparation phase where the data was cleaned, labels were prepared, redundant features were reduced, train and test sets were created, and a controlled multiclass dataset was prepared for more reliable modelling.</w:t>
+      </w:r>
+    </w:p>
+    <w:p>
+      <w:pPr>
+        <w:rPr>
+          <w:szCs w:val="24"/>
+        </w:rPr>
+      </w:pPr>
+    </w:p>
+    <w:p>
+      <w:pPr>
+        <w:pStyle w:val="Heading1"/>
+        <w:numPr>
+          <w:ilvl w:val="0"/>
+          <w:numId w:val="2"/>
+        </w:numPr>
+        <w:ind w:left="630"/>
+        <w:jc w:val="both"/>
+        <w:rPr>
+          <w:rFonts w:ascii="Times New Roman" w:hAnsi="Times New Roman" w:cs="Times New Roman"/>
+          <w:b/>
+          <w:bCs/>
+          <w:color w:val="auto"/>
+        </w:rPr>
+      </w:pPr>
+      <w:r>
+        <w:rPr>
+          <w:rFonts w:ascii="Times New Roman" w:hAnsi="Times New Roman" w:cs="Times New Roman"/>
+          <w:b/>
+          <w:bCs/>
+          <w:color w:val="auto"/>
+        </w:rPr>
+        <w:lastRenderedPageBreak/>
         <w:t>Data Preparation</w:t>
       </w:r>
       <w:r>
@@ -2619,7 +3055,6 @@
         <w:jc w:val="both"/>
       </w:pPr>
       <w:r>
-        <w:lastRenderedPageBreak/>
         <w:tab/>
       </w:r>
       <w:r>
@@ -3230,6 +3665,7 @@
                 <w:b/>
                 <w:bCs/>
               </w:rPr>
+              <w:lastRenderedPageBreak/>
               <w:t>4</w:t>
             </w:r>
           </w:p>
@@ -4131,6 +4567,7 @@
         <w:jc w:val="both"/>
       </w:pPr>
       <w:r>
+        <w:lastRenderedPageBreak/>
         <w:tab/>
       </w:r>
       <w:r>
@@ -4249,11 +4686,7 @@
       </w:r>
       <w:proofErr w:type="spellEnd"/>
       <w:r>
-        <w:t xml:space="preserve">” assures that every time we run this same program/code it will provide the same results, even if used in different </w:t>
-      </w:r>
-      <w:r>
-        <w:lastRenderedPageBreak/>
-        <w:t>machines. It also ensures that we will not produce different datasets every time when using split, which is not good to train model with different data every time</w:t>
+        <w:t>” assures that every time we run this same program/code it will provide the same results, even if used in different machines. It also ensures that we will not produce different datasets every time when using split, which is not good to train model with different data every time</w:t>
       </w:r>
       <w:sdt>
         <w:sdtPr>
@@ -4719,6 +5152,7 @@
         <w:jc w:val="both"/>
       </w:pPr>
       <w:r>
+        <w:lastRenderedPageBreak/>
         <w:tab/>
       </w:r>
       <w:r>
@@ -4807,7 +5241,6 @@
         <w:jc w:val="both"/>
       </w:pPr>
       <w:r>
-        <w:lastRenderedPageBreak/>
         <w:tab/>
       </w:r>
       <w:r>
@@ -6011,7 +6444,6 @@
       </w:pPr>
       <w:proofErr w:type="spellStart"/>
       <w:r>
-        <w:lastRenderedPageBreak/>
         <w:t>X_test_ctrl</w:t>
       </w:r>
       <w:proofErr w:type="spellEnd"/>

</xml_diff>

<commit_message>
docs: added my team collaboration reflection
Added my individual team collaboration and reflection section for the appendix.

Summarised my main contributions to data cleaning, data preparation, Logistic Regression and Decision Tree modelling, notebook review, evaluation interpretation, deployment preparation and Streamlit dashboard development.

Explained how responsibilities were shared and adjusted during the project, including collaboration with Sander on notebook organisation, model evaluation and report writing.

Highlighted teamwork, communication, shared decision-making and learning outcomes from the IDS project.
</commit_message>
<xml_diff>
--- a/Sander2022164_Thiago2022161_Report.docx
+++ b/Sander2022164_Thiago2022161_Report.docx
@@ -341,6 +341,7 @@
           <w:sz w:val="36"/>
           <w:szCs w:val="36"/>
         </w:rPr>
+        <w:lastRenderedPageBreak/>
         <w:t>Abstract</w:t>
       </w:r>
     </w:p>
@@ -5530,6 +5531,7 @@
           <w:sz w:val="28"/>
           <w:szCs w:val="28"/>
         </w:rPr>
+        <w:lastRenderedPageBreak/>
         <w:t xml:space="preserve">CFS </w:t>
       </w:r>
       <w:r>
@@ -5619,6 +5621,7 @@
           <w:bCs/>
           <w:color w:val="auto"/>
         </w:rPr>
+        <w:lastRenderedPageBreak/>
         <w:t>Introduction</w:t>
       </w:r>
       <w:bookmarkEnd w:id="0"/>
@@ -5654,7 +5657,6 @@
           <w:id w:val="-667025716"/>
           <w:citation/>
         </w:sdtPr>
-        <w:sdtEndPr/>
         <w:sdtContent>
           <w:r>
             <w:fldChar w:fldCharType="begin"/>
@@ -5735,7 +5737,6 @@
           <w:id w:val="-1831198940"/>
           <w:citation/>
         </w:sdtPr>
-        <w:sdtEndPr/>
         <w:sdtContent>
           <w:r>
             <w:fldChar w:fldCharType="begin"/>
@@ -5930,6 +5931,7 @@
       </w:pPr>
       <w:bookmarkStart w:id="4" w:name="_Toc230019185"/>
       <w:r>
+        <w:lastRenderedPageBreak/>
         <w:t>Research Questions</w:t>
       </w:r>
       <w:bookmarkEnd w:id="4"/>
@@ -6021,7 +6023,19 @@
         <w:tab/>
       </w:r>
       <w:r>
-        <w:t>The responsibilities were initially divided across the CRISP-DM phases. However, continuous collaboration, discussion, and knowledge sharing occurred throughout the entire project lifecycle. Further details regarding individual contributions and group collaboration can be found in Appendix 2.</w:t>
+        <w:t>The responsibilities were initially divided across the CRISP-DM phases. However, continuous collaboration, discussion, and knowledge sharing occurred throughout the entire project lifecycle</w:t>
+      </w:r>
+      <w:r>
+        <w:t xml:space="preserve">, </w:t>
+      </w:r>
+      <w:r>
+        <w:t>and the group could also count on the technical supervision and guidance of Dr. Muhammad Iqbal</w:t>
+      </w:r>
+      <w:r>
+        <w:t xml:space="preserve">. </w:t>
+      </w:r>
+      <w:r>
+        <w:t>Further details regarding individual contributions and group collaboration can be found in Appendix 2.</w:t>
       </w:r>
     </w:p>
     <w:p>
@@ -6112,7 +6126,6 @@
           <w:id w:val="-113062448"/>
           <w:citation/>
         </w:sdtPr>
-        <w:sdtEndPr/>
         <w:sdtContent>
           <w:r>
             <w:fldChar w:fldCharType="begin"/>
@@ -6176,7 +6189,6 @@
           <w:id w:val="1560663956"/>
           <w:citation/>
         </w:sdtPr>
-        <w:sdtEndPr/>
         <w:sdtContent>
           <w:r>
             <w:fldChar w:fldCharType="begin"/>
@@ -6432,6 +6444,7 @@
           <w:b/>
           <w:bCs/>
         </w:rPr>
+        <w:lastRenderedPageBreak/>
         <w:t>Evaluation</w:t>
       </w:r>
       <w:r>
@@ -6555,24 +6568,14 @@
       <w:r>
         <w:t xml:space="preserve">Figure </w:t>
       </w:r>
-      <w:r>
-        <w:fldChar w:fldCharType="begin"/>
-      </w:r>
-      <w:r>
-        <w:instrText xml:space="preserve"> SEQ Figure \* ARABIC </w:instrText>
-      </w:r>
-      <w:r>
-        <w:fldChar w:fldCharType="separate"/>
-      </w:r>
-      <w:r>
-        <w:rPr>
-          <w:noProof/>
-        </w:rPr>
-        <w:t>1</w:t>
-      </w:r>
-      <w:r>
-        <w:fldChar w:fldCharType="end"/>
-      </w:r>
+      <w:fldSimple w:instr=" SEQ Figure \* ARABIC ">
+        <w:r>
+          <w:rPr>
+            <w:noProof/>
+          </w:rPr>
+          <w:t>1</w:t>
+        </w:r>
+      </w:fldSimple>
       <w:r>
         <w:t>: Crisp-DM Framework's Lifecycle</w:t>
       </w:r>
@@ -6627,6 +6630,7 @@
         <w:jc w:val="both"/>
       </w:pPr>
       <w:r>
+        <w:lastRenderedPageBreak/>
         <w:tab/>
       </w:r>
       <w:r>
@@ -6768,6 +6772,7 @@
       </w:pPr>
       <w:bookmarkStart w:id="13" w:name="_Toc230019196"/>
       <w:r>
+        <w:lastRenderedPageBreak/>
         <w:t>3.4 Business Objectives</w:t>
       </w:r>
       <w:bookmarkEnd w:id="13"/>
@@ -6900,6 +6905,7 @@
     </w:p>
     <w:p>
       <w:r>
+        <w:lastRenderedPageBreak/>
         <w:t>Therefore, privacy and data protection must be addressed. The system should follow GDPR principles, such as lawful processing, data minimisation, secure storage, and controlled access. Only the information necessary for security monitoring should be collected and not the entire content of user communication (GDPR, 2018; ICO, 2024).</w:t>
       </w:r>
     </w:p>
@@ -7057,6 +7063,7 @@
       </w:pPr>
       <w:bookmarkStart w:id="20" w:name="_Toc230019203"/>
       <w:r>
+        <w:lastRenderedPageBreak/>
         <w:t>4.1 Dataset Description</w:t>
       </w:r>
       <w:bookmarkEnd w:id="20"/>
@@ -7221,6 +7228,7 @@
       </w:pPr>
       <w:bookmarkStart w:id="23" w:name="_Toc230019206"/>
       <w:r>
+        <w:lastRenderedPageBreak/>
         <w:t>4.4 Missing, Infinite Values and Data Quality</w:t>
       </w:r>
       <w:bookmarkEnd w:id="23"/>
@@ -7355,6 +7363,7 @@
         <w:rPr>
           <w:szCs w:val="24"/>
         </w:rPr>
+        <w:lastRenderedPageBreak/>
         <w:t>The analysis also revealed significant issues such as class imbalance, rare attack classes, missing and infinite values, duplicates, constant and highly correlated features and large-scale differences.</w:t>
       </w:r>
     </w:p>
@@ -7453,7 +7462,6 @@
           <w:id w:val="-779103480"/>
           <w:citation/>
         </w:sdtPr>
-        <w:sdtEndPr/>
         <w:sdtContent>
           <w:r>
             <w:fldChar w:fldCharType="begin"/>
@@ -7734,6 +7742,7 @@
         <w:jc w:val="both"/>
       </w:pPr>
       <w:r>
+        <w:lastRenderedPageBreak/>
         <w:tab/>
       </w:r>
       <w:r>
@@ -7747,7 +7756,6 @@
           <w:id w:val="-1281941765"/>
           <w:citation/>
         </w:sdtPr>
-        <w:sdtEndPr/>
         <w:sdtContent>
           <w:r>
             <w:fldChar w:fldCharType="begin"/>
@@ -8788,7 +8796,6 @@
           <w:id w:val="1909498252"/>
           <w:citation/>
         </w:sdtPr>
-        <w:sdtEndPr/>
         <w:sdtContent>
           <w:r>
             <w:fldChar w:fldCharType="begin"/>
@@ -8818,7 +8825,6 @@
           <w:id w:val="-596181105"/>
           <w:citation/>
         </w:sdtPr>
-        <w:sdtEndPr/>
         <w:sdtContent>
           <w:r>
             <w:fldChar w:fldCharType="begin"/>
@@ -8898,6 +8904,7 @@
       </w:pPr>
       <w:bookmarkStart w:id="32" w:name="_Toc230019215"/>
       <w:r>
+        <w:lastRenderedPageBreak/>
         <w:t>Train/Test Split</w:t>
       </w:r>
       <w:bookmarkEnd w:id="32"/>
@@ -8987,7 +8994,6 @@
           <w:id w:val="-1947452564"/>
           <w:citation/>
         </w:sdtPr>
-        <w:sdtEndPr/>
         <w:sdtContent>
           <w:r>
             <w:fldChar w:fldCharType="begin"/>
@@ -9153,7 +9159,6 @@
           <w:id w:val="61614732"/>
           <w:citation/>
         </w:sdtPr>
-        <w:sdtEndPr/>
         <w:sdtContent>
           <w:r>
             <w:fldChar w:fldCharType="begin"/>
@@ -9388,7 +9393,11 @@
         <w:t xml:space="preserve"> For this approach, </w:t>
       </w:r>
       <w:r>
-        <w:t xml:space="preserve">it was limited to 10,000 records </w:t>
+        <w:t xml:space="preserve">it was </w:t>
+      </w:r>
+      <w:r>
+        <w:lastRenderedPageBreak/>
+        <w:t xml:space="preserve">limited to 10,000 records </w:t>
       </w:r>
       <w:r>
         <w:t>the number of samples per class</w:t>
@@ -9415,24 +9424,14 @@
       <w:r>
         <w:t xml:space="preserve">Table </w:t>
       </w:r>
-      <w:r>
-        <w:fldChar w:fldCharType="begin"/>
-      </w:r>
-      <w:r>
-        <w:instrText xml:space="preserve"> SEQ Table \* ARABIC </w:instrText>
-      </w:r>
-      <w:r>
-        <w:fldChar w:fldCharType="separate"/>
-      </w:r>
-      <w:r>
-        <w:rPr>
-          <w:noProof/>
-        </w:rPr>
-        <w:t>2</w:t>
-      </w:r>
-      <w:r>
-        <w:fldChar w:fldCharType="end"/>
-      </w:r>
+      <w:fldSimple w:instr=" SEQ Table \* ARABIC ">
+        <w:r>
+          <w:rPr>
+            <w:noProof/>
+          </w:rPr>
+          <w:t>2</w:t>
+        </w:r>
+      </w:fldSimple>
       <w:r>
         <w:t xml:space="preserve">: </w:t>
       </w:r>
@@ -10060,24 +10059,14 @@
       <w:r>
         <w:t xml:space="preserve">Table </w:t>
       </w:r>
-      <w:r>
-        <w:fldChar w:fldCharType="begin"/>
-      </w:r>
-      <w:r>
-        <w:instrText xml:space="preserve"> SEQ Table \* ARABIC </w:instrText>
-      </w:r>
-      <w:r>
-        <w:fldChar w:fldCharType="separate"/>
-      </w:r>
-      <w:r>
-        <w:rPr>
-          <w:noProof/>
-        </w:rPr>
-        <w:t>3</w:t>
-      </w:r>
-      <w:r>
-        <w:fldChar w:fldCharType="end"/>
-      </w:r>
+      <w:fldSimple w:instr=" SEQ Table \* ARABIC ">
+        <w:r>
+          <w:rPr>
+            <w:noProof/>
+          </w:rPr>
+          <w:t>3</w:t>
+        </w:r>
+      </w:fldSimple>
       <w:r>
         <w:t>:</w:t>
       </w:r>
@@ -10307,24 +10296,14 @@
       <w:r>
         <w:t xml:space="preserve">Table </w:t>
       </w:r>
-      <w:r>
-        <w:fldChar w:fldCharType="begin"/>
-      </w:r>
-      <w:r>
-        <w:instrText xml:space="preserve"> SEQ Table \* ARABIC </w:instrText>
-      </w:r>
-      <w:r>
-        <w:fldChar w:fldCharType="separate"/>
-      </w:r>
-      <w:r>
-        <w:rPr>
-          <w:noProof/>
-        </w:rPr>
-        <w:t>4</w:t>
-      </w:r>
-      <w:r>
-        <w:fldChar w:fldCharType="end"/>
-      </w:r>
+      <w:fldSimple w:instr=" SEQ Table \* ARABIC ">
+        <w:r>
+          <w:rPr>
+            <w:noProof/>
+          </w:rPr>
+          <w:t>4</w:t>
+        </w:r>
+      </w:fldSimple>
       <w:r>
         <w:t>: Encoded values for classes in Controlled Dataset</w:t>
       </w:r>
@@ -10398,6 +10377,7 @@
               <w:jc w:val="center"/>
             </w:pPr>
             <w:r>
+              <w:lastRenderedPageBreak/>
               <w:t>0</w:t>
             </w:r>
           </w:p>
@@ -10941,7 +10921,6 @@
           <w:id w:val="250778773"/>
           <w:citation/>
         </w:sdtPr>
-        <w:sdtEndPr/>
         <w:sdtContent>
           <w:r>
             <w:fldChar w:fldCharType="begin"/>
@@ -10995,7 +10974,6 @@
         <w:sdtPr>
           <w:id w:val="787391154"/>
         </w:sdtPr>
-        <w:sdtEndPr/>
         <w:sdtContent>
           <w:r>
             <w:fldChar w:fldCharType="begin"/>
@@ -11213,7 +11191,11 @@
         <w:t xml:space="preserve"> (n_estimators)</w:t>
       </w:r>
       <w:r>
-        <w:t>. Instead of using a single tree for classification, the algorithm generates several trees using different bootstrap samples taken from the original dataset. Each tree independently analyses the input data and produces its own classification result. During prediction, the final class is selected based on the majority vote across all trees in the forest. This approach helps improve model stability, reduce overfitting, and increase classification reliability compared to using a single Decision Tree model</w:t>
+        <w:t xml:space="preserve">. Instead of using a single tree for classification, the </w:t>
+      </w:r>
+      <w:r>
+        <w:lastRenderedPageBreak/>
+        <w:t>algorithm generates several trees using different bootstrap samples taken from the original dataset. Each tree independently analyses the input data and produces its own classification result. During prediction, the final class is selected based on the majority vote across all trees in the forest. This approach helps improve model stability, reduce overfitting, and increase classification reliability compared to using a single Decision Tree model</w:t>
       </w:r>
       <w:r>
         <w:t xml:space="preserve"> </w:t>
@@ -11223,7 +11205,6 @@
           <w:id w:val="999927034"/>
           <w:citation/>
         </w:sdtPr>
-        <w:sdtEndPr/>
         <w:sdtContent>
           <w:r>
             <w:fldChar w:fldCharType="begin"/>
@@ -11391,7 +11372,6 @@
           <w:id w:val="-855878046"/>
           <w:citation/>
         </w:sdtPr>
-        <w:sdtEndPr/>
         <w:sdtContent>
           <w:r>
             <w:fldChar w:fldCharType="begin"/>
@@ -11490,7 +11470,6 @@
           <w:id w:val="-2080740079"/>
           <w:citation/>
         </w:sdtPr>
-        <w:sdtEndPr/>
         <w:sdtContent>
           <w:r>
             <w:fldChar w:fldCharType="begin"/>
@@ -11602,24 +11581,14 @@
       <w:r>
         <w:t xml:space="preserve">Figure </w:t>
       </w:r>
-      <w:r>
-        <w:fldChar w:fldCharType="begin"/>
-      </w:r>
-      <w:r>
-        <w:instrText xml:space="preserve"> SEQ Figure \* ARABIC </w:instrText>
-      </w:r>
-      <w:r>
-        <w:fldChar w:fldCharType="separate"/>
-      </w:r>
-      <w:r>
-        <w:rPr>
-          <w:noProof/>
-        </w:rPr>
-        <w:t>2</w:t>
-      </w:r>
-      <w:r>
-        <w:fldChar w:fldCharType="end"/>
-      </w:r>
+      <w:fldSimple w:instr=" SEQ Figure \* ARABIC ">
+        <w:r>
+          <w:rPr>
+            <w:noProof/>
+          </w:rPr>
+          <w:t>2</w:t>
+        </w:r>
+      </w:fldSimple>
       <w:r>
         <w:t xml:space="preserve">: </w:t>
       </w:r>
@@ -11713,7 +11682,11 @@
         <w:t xml:space="preserve"> </w:t>
       </w:r>
       <w:r>
-        <w:t xml:space="preserve">with only a random_state = 42, and </w:t>
+        <w:t xml:space="preserve">with only a </w:t>
+      </w:r>
+      <w:r>
+        <w:lastRenderedPageBreak/>
+        <w:t xml:space="preserve">random_state = 42, and </w:t>
       </w:r>
       <w:r>
         <w:t>the</w:t>
@@ -11811,24 +11784,14 @@
       <w:r>
         <w:t xml:space="preserve">Figure </w:t>
       </w:r>
-      <w:r>
-        <w:fldChar w:fldCharType="begin"/>
-      </w:r>
-      <w:r>
-        <w:instrText xml:space="preserve"> SEQ Figure \* ARABIC </w:instrText>
-      </w:r>
-      <w:r>
-        <w:fldChar w:fldCharType="separate"/>
-      </w:r>
-      <w:r>
-        <w:rPr>
-          <w:noProof/>
-        </w:rPr>
-        <w:t>3</w:t>
-      </w:r>
-      <w:r>
-        <w:fldChar w:fldCharType="end"/>
-      </w:r>
+      <w:fldSimple w:instr=" SEQ Figure \* ARABIC ">
+        <w:r>
+          <w:rPr>
+            <w:noProof/>
+          </w:rPr>
+          <w:t>3</w:t>
+        </w:r>
+      </w:fldSimple>
       <w:r>
         <w:t>: Decision Tree</w:t>
       </w:r>
@@ -12141,7 +12104,6 @@
           <w:id w:val="1670050296"/>
           <w:citation/>
         </w:sdtPr>
-        <w:sdtEndPr/>
         <w:sdtContent>
           <w:r>
             <w:fldChar w:fldCharType="begin"/>
@@ -12425,24 +12387,14 @@
       <w:r>
         <w:t xml:space="preserve">Figure </w:t>
       </w:r>
-      <w:r>
-        <w:fldChar w:fldCharType="begin"/>
-      </w:r>
-      <w:r>
-        <w:instrText xml:space="preserve"> SEQ Figure \* ARABIC </w:instrText>
-      </w:r>
-      <w:r>
-        <w:fldChar w:fldCharType="separate"/>
-      </w:r>
-      <w:r>
-        <w:rPr>
-          <w:noProof/>
-        </w:rPr>
-        <w:t>4</w:t>
-      </w:r>
-      <w:r>
-        <w:fldChar w:fldCharType="end"/>
-      </w:r>
+      <w:fldSimple w:instr=" SEQ Figure \* ARABIC ">
+        <w:r>
+          <w:rPr>
+            <w:noProof/>
+          </w:rPr>
+          <w:t>4</w:t>
+        </w:r>
+      </w:fldSimple>
       <w:r>
         <w:t>: Logistic Regression</w:t>
       </w:r>
@@ -12474,6 +12426,7 @@
           <w:bCs/>
           <w:color w:val="auto"/>
         </w:rPr>
+        <w:lastRenderedPageBreak/>
         <w:t>Evaluation</w:t>
       </w:r>
       <w:r>
@@ -12764,6 +12717,7 @@
       <w:r>
         <w:t xml:space="preserve">also tested. Baseline means without </w:t>
       </w:r>
+      <w:proofErr w:type="spellStart"/>
       <w:r>
         <w:t>class</w:t>
       </w:r>
@@ -12781,6 +12735,7 @@
         </w:rPr>
         <w:t>eight</w:t>
       </w:r>
+      <w:proofErr w:type="spellEnd"/>
       <w:r>
         <w:rPr>
           <w:i/>
@@ -12846,7 +12801,11 @@
         <w:t>d</w:t>
       </w:r>
       <w:r>
-        <w:t xml:space="preserve"> 2 was selected for the following reasons: it preserved all 15 traffic classes, showed good performance on the main traffic classe</w:t>
+        <w:t xml:space="preserve"> 2 was selected for the following reasons: it preserved all 15 </w:t>
+      </w:r>
+      <w:r>
+        <w:lastRenderedPageBreak/>
+        <w:t>traffic classes, showed good performance on the main traffic classe</w:t>
       </w:r>
       <w:r>
         <w:t>s, had low runtime and detected some rare attacks.</w:t>
@@ -13062,7 +13021,11 @@
         <w:t xml:space="preserve"> network flow data, using the same 39 features selected during training. </w:t>
       </w:r>
       <w:r>
-        <w:t xml:space="preserve">In a future implementation, an additional flow extraction layer would be needed to convert </w:t>
+        <w:t xml:space="preserve">In a future implementation, an additional flow extraction </w:t>
+      </w:r>
+      <w:r>
+        <w:lastRenderedPageBreak/>
+        <w:t xml:space="preserve">layer would be needed to convert </w:t>
       </w:r>
       <w:r>
         <w:t xml:space="preserve">live network traffic or packet captures into the required feature format before </w:t>
@@ -13196,6 +13159,15 @@
           <w:color w:val="auto"/>
         </w:rPr>
         <w:t xml:space="preserve"> 1</w:t>
+      </w:r>
+      <w:r>
+        <w:rPr>
+          <w:rFonts w:ascii="Times New Roman" w:hAnsi="Times New Roman" w:cs="Times New Roman"/>
+          <w:b/>
+          <w:bCs/>
+          <w:color w:val="auto"/>
+        </w:rPr>
+        <w:t xml:space="preserve"> (GitHub)</w:t>
       </w:r>
     </w:p>
     <w:p/>
@@ -13249,10 +13221,17 @@
       </w:hyperlink>
     </w:p>
     <w:p>
-      <w:r>
-        <w:t>Thiago’s Repository</w:t>
-      </w:r>
-    </w:p>
+      <w:hyperlink r:id="rId15" w:history="1">
+        <w:r>
+          <w:rPr>
+            <w:rStyle w:val="Hyperlink"/>
+          </w:rPr>
+          <w:t>Thiago’s Repository</w:t>
+        </w:r>
+      </w:hyperlink>
+    </w:p>
+    <w:p/>
+    <w:p/>
     <w:p>
       <w:pPr>
         <w:pStyle w:val="Heading1"/>
@@ -13272,13 +13251,258 @@
           <w:bCs/>
           <w:color w:val="auto"/>
         </w:rPr>
+        <w:lastRenderedPageBreak/>
         <w:t>Appendix 2</w:t>
       </w:r>
-    </w:p>
-    <w:p>
-      <w:pPr>
+      <w:r>
+        <w:rPr>
+          <w:rFonts w:ascii="Times New Roman" w:hAnsi="Times New Roman" w:cs="Times New Roman"/>
+          <w:b/>
+          <w:bCs/>
+          <w:color w:val="auto"/>
+        </w:rPr>
+        <w:t xml:space="preserve"> (Team collaboration and </w:t>
+      </w:r>
+      <w:r>
+        <w:rPr>
+          <w:rFonts w:ascii="Times New Roman" w:hAnsi="Times New Roman" w:cs="Times New Roman"/>
+          <w:b/>
+          <w:bCs/>
+          <w:color w:val="auto"/>
+        </w:rPr>
+        <w:t>reflexion)</w:t>
+      </w:r>
+    </w:p>
+    <w:p/>
+    <w:p>
+      <w:pPr>
+        <w:rPr>
+          <w:b/>
+          <w:bCs/>
+        </w:rPr>
+      </w:pPr>
+      <w:r>
+        <w:rPr>
+          <w:b/>
+          <w:bCs/>
+        </w:rPr>
+        <w:t xml:space="preserve">Sander Soares </w:t>
+      </w:r>
+      <w:r>
+        <w:rPr>
+          <w:b/>
+          <w:bCs/>
+        </w:rPr>
+        <w:t>–</w:t>
+      </w:r>
+      <w:r>
+        <w:rPr>
+          <w:b/>
+          <w:bCs/>
+        </w:rPr>
+        <w:t xml:space="preserve"> 2022164</w:t>
+      </w:r>
+    </w:p>
+    <w:p>
+      <w:pPr>
+        <w:ind w:firstLine="720"/>
         <w:jc w:val="both"/>
       </w:pPr>
+      <w:r>
+        <w:t>I was initially responsible for the coding part of Data Understanding, EDA, and for modelling Random Forest. The dataset was found by both of us during one of the Tuesdays while waiting to talk to our supervisor.</w:t>
+      </w:r>
+    </w:p>
+    <w:p>
+      <w:pPr>
+        <w:ind w:firstLine="720"/>
+        <w:jc w:val="both"/>
+      </w:pPr>
+      <w:r>
+        <w:t>After it was found, I could start coding the Data Understanding phase and plotting the EDA graphs. We then discussed my findings, and I had to make some alterations. Then, Thiago could proceed with Data Preparation, which was necessary prior to modelling any machine learning models.</w:t>
+      </w:r>
+    </w:p>
+    <w:p>
+      <w:pPr>
+        <w:ind w:firstLine="720"/>
+        <w:jc w:val="both"/>
+      </w:pPr>
+      <w:r>
+        <w:t>Once it was finished, I could start modelling my machine learning model while he was working on his own models. We could then compare the results and discuss which models had the best performance.</w:t>
+      </w:r>
+    </w:p>
+    <w:p>
+      <w:pPr>
+        <w:ind w:firstLine="720"/>
+        <w:jc w:val="both"/>
+      </w:pPr>
+      <w:r>
+        <w:t>In one of the meetings with our supervisor, Dr. Mohammed, I thought about creating extra dataset strategies and applying them to our models to observe what would happen and gather additional information. Therefore, I decided to create a controlled dataset by removing the minority classes. The results were very good for comparison purposes.</w:t>
+      </w:r>
+    </w:p>
+    <w:p>
+      <w:pPr>
+        <w:ind w:firstLine="720"/>
+        <w:jc w:val="both"/>
+      </w:pPr>
+      <w:r>
+        <w:t xml:space="preserve">After merging the codes, as we were working simultaneously, the </w:t>
+      </w:r>
+      <w:proofErr w:type="spellStart"/>
+      <w:r>
+        <w:t>Jupyter</w:t>
+      </w:r>
+      <w:proofErr w:type="spellEnd"/>
+      <w:r>
+        <w:t xml:space="preserve"> Notebook became very disorganised. So, I was responsible for reorganising the file workflow to follow a better structure and make more sense to whoever was reading it, adding titles, markdown explanations, and starting the drafting of the Evaluation phase.</w:t>
+      </w:r>
+    </w:p>
+    <w:p>
+      <w:pPr>
+        <w:ind w:firstLine="720"/>
+        <w:jc w:val="both"/>
+      </w:pPr>
+      <w:r>
+        <w:t>We had a lot of communication during all phases to align the results, discuss findings, and check if both agreed before continuing with the next stages.</w:t>
+      </w:r>
+    </w:p>
+    <w:p>
+      <w:pPr>
+        <w:ind w:firstLine="720"/>
+        <w:jc w:val="both"/>
+      </w:pPr>
+      <w:r>
+        <w:t>Then, during the report writing phase, we kind of changed roles, which helped me understand more about what he had done. I became responsible for the Introduction, Research Methodology, Data Preparation, and Modelling sections.</w:t>
+      </w:r>
+    </w:p>
+    <w:p>
+      <w:pPr>
+        <w:ind w:firstLine="720"/>
+        <w:jc w:val="both"/>
+      </w:pPr>
+      <w:r>
+        <w:t>I believe it was very smart to change some of the CRISP-DM responsibilities, as it helped both of us, I presume, to understand in more detail what the other person had done, ensuring that we were both fully aligned with the project.</w:t>
+      </w:r>
+    </w:p>
+    <w:p>
+      <w:pPr>
+        <w:ind w:firstLine="720"/>
+        <w:jc w:val="both"/>
+      </w:pPr>
+      <w:r>
+        <w:t>Being part of this project was very challenging and enjoyable. I could understand much more about Machine Learning and Data Science, while also working with something I would like to pursue in the future, which is Networking. It was challenging to manage work, classes, and the project simultaneously, but the feeling of achievement could not be better.</w:t>
+      </w:r>
+    </w:p>
+    <w:p>
+      <w:pPr>
+        <w:ind w:firstLine="720"/>
+        <w:jc w:val="both"/>
+      </w:pPr>
+      <w:r>
+        <w:t>Working with Thiago as a pair was also very positive, because I always felt comfortable expressing my ideas without judgement, and we had a very good journey together without disagreements.</w:t>
+      </w:r>
+    </w:p>
+    <w:p>
+      <w:pPr>
+        <w:jc w:val="both"/>
+      </w:pPr>
+    </w:p>
+    <w:p>
+      <w:pPr>
+        <w:rPr>
+          <w:b/>
+          <w:bCs/>
+        </w:rPr>
+      </w:pPr>
+      <w:r>
+        <w:rPr>
+          <w:b/>
+          <w:bCs/>
+        </w:rPr>
+        <w:t>Thiago Goncalves da Costa – 2022161</w:t>
+      </w:r>
+    </w:p>
+    <w:p>
+      <w:r>
+        <w:lastRenderedPageBreak/>
+        <w:t xml:space="preserve">After we decided to develop the </w:t>
+      </w:r>
+      <w:r>
+        <w:t xml:space="preserve">IDS </w:t>
+      </w:r>
+      <w:r>
+        <w:t xml:space="preserve">project using the CICIDS2017 dataset, Sander and I divided the first technical tasks. </w:t>
+      </w:r>
+    </w:p>
+    <w:p>
+      <w:r>
+        <w:t>My first main contribution was preparing the dataset for machine learning. I worked on cleaning the data, fixing quality issues, preparing the target variable, reducing unnecessary features and creating the train/test split. This was important because the dataset was large and needed to be properly prepared befor</w:t>
+      </w:r>
+      <w:r>
+        <w:t>e any reliable modelling could be done.</w:t>
+      </w:r>
+    </w:p>
+    <w:p>
+      <w:r>
+        <w:t xml:space="preserve">After the preparation stage, I worked with Logistic Regression and Decision Tree. I tested the </w:t>
+      </w:r>
+      <w:r>
+        <w:t>baseline</w:t>
+      </w:r>
+      <w:r>
+        <w:t xml:space="preserve"> and balanced versions of the models on the capped </w:t>
+      </w:r>
+      <w:r>
+        <w:t>sample and</w:t>
+      </w:r>
+      <w:r>
+        <w:t xml:space="preserve"> </w:t>
+      </w:r>
+      <w:r>
+        <w:t xml:space="preserve">tested the balanced versions on the controlled dataset. </w:t>
+      </w:r>
+    </w:p>
+    <w:p>
+      <w:r>
+        <w:t>After we merged our work, the notebook needed some reorganisation because we had both been coding different parts at the same time. Sander was responsible for reorganising the main workflow and adding some missing model versions. After that, I reviewed the noteboo</w:t>
+      </w:r>
+      <w:r>
+        <w:t>k, improved some explanations, corrected terminology, and helped align the model selection section with the final results he had organised.</w:t>
+      </w:r>
+    </w:p>
+    <w:p>
+      <w:r>
+        <w:t xml:space="preserve">Near the end of the project, I worked on the Deployment Preparation and Streamlit dashboard. I saved the final model, label encoder and feature list using Joblib, created a prediction </w:t>
+      </w:r>
+      <w:r>
+        <w:t xml:space="preserve">function, and then developed the IDS dashboard. </w:t>
+      </w:r>
+    </w:p>
+    <w:p>
+      <w:r>
+        <w:t>For the written report, we changed some responsibilities compared with the coding stage, and I worked on the Business Understanding, Data Understanding, Evaluation</w:t>
+      </w:r>
+      <w:r>
+        <w:t xml:space="preserve"> and </w:t>
+      </w:r>
+      <w:r>
+        <w:t>Prototype Deployment</w:t>
+      </w:r>
+      <w:r>
+        <w:t xml:space="preserve"> sections. This helped both of us better understand each other’s work and made the final report more consistent.</w:t>
+      </w:r>
+    </w:p>
+    <w:p>
+      <w:r>
+        <w:t xml:space="preserve">During this project, Sander and I communicated a lot and helped each other with decisions, explanations and corrections. Working with him was very positive because we already knew we worked well together, and this made the project easier to manage. I always </w:t>
+      </w:r>
+      <w:r>
+        <w:t>felt comfortable sharing ideas, asking questions and discussing changes, and we always supported each other.</w:t>
+      </w:r>
+    </w:p>
+    <w:p>
+      <w:r>
+        <w:t>Overall, this project was challenging but very valuable. I learned more about data preparation, machine learning, model evaluation, class imbalance and deployment. I also enjoyed working on a cybersecurity and networking topic because it connects well with my professional interests.</w:t>
+      </w:r>
     </w:p>
     <w:p/>
     <w:p/>
@@ -13309,12 +13533,12 @@
       </w:pPr>
     </w:p>
     <w:sectPr>
-      <w:headerReference w:type="even" r:id="rId15"/>
-      <w:headerReference w:type="default" r:id="rId16"/>
-      <w:footerReference w:type="even" r:id="rId17"/>
-      <w:footerReference w:type="default" r:id="rId18"/>
-      <w:headerReference w:type="first" r:id="rId19"/>
-      <w:footerReference w:type="first" r:id="rId20"/>
+      <w:headerReference w:type="even" r:id="rId16"/>
+      <w:headerReference w:type="default" r:id="rId17"/>
+      <w:footerReference w:type="even" r:id="rId18"/>
+      <w:footerReference w:type="default" r:id="rId19"/>
+      <w:headerReference w:type="first" r:id="rId20"/>
+      <w:footerReference w:type="first" r:id="rId21"/>
       <w:pgSz w:w="11906" w:h="16838"/>
       <w:pgMar w:top="1440" w:right="1440" w:bottom="1440" w:left="1440" w:header="708" w:footer="708" w:gutter="0"/>
       <w:pgNumType w:start="0"/>

</xml_diff>